<commit_message>
feat: enhance validation rules and requirements for asset management and sale listings
</commit_message>
<xml_diff>
--- a/SourceInputs/Tukdaeng Marketplace - Required Fields for Sale Listing.docx
+++ b/SourceInputs/Tukdaeng Marketplace - Required Fields for Sale Listing.docx
@@ -533,18 +533,18 @@
               <w:pStyle w:val="Compact"/>
             </w:pPr>
             <w:r>
-              <w:t xml:space="preserve">Price (THB)</w:t>
-            </w:r>
-          </w:p>
-        </w:tc>
-        <w:tc>
-          <w:tcPr/>
-          <w:p>
-            <w:pPr>
-              <w:pStyle w:val="Compact"/>
-            </w:pPr>
-            <w:r>
-              <w:t xml:space="preserve">Yes</w:t>
+              <w:t xml:space="preserve">Asking Price (THB)</w:t>
+            </w:r>
+          </w:p>
+        </w:tc>
+        <w:tc>
+          <w:tcPr/>
+          <w:p>
+            <w:pPr>
+              <w:pStyle w:val="Compact"/>
+            </w:pPr>
+            <w:r>
+              <w:t xml:space="preserve">No (optional)</w:t>
             </w:r>
           </w:p>
         </w:tc>
@@ -600,7 +600,7 @@
         </w:numPr>
       </w:pPr>
       <w:r>
-        <w:t xml:space="preserve">Must be greater than 0</w:t>
+        <w:t xml:space="preserve">Optional. If filled, must be greater than 0. If empty, buyer-facing surfaces must show Price on request.</w:t>
       </w:r>
     </w:p>
     <w:bookmarkEnd w:id="25"/>
@@ -1125,7 +1125,7 @@
         <w:pStyle w:val="FirstParagraph"/>
       </w:pPr>
       <w:r>
-        <w:t xml:space="preserve">All purchase-related information should be optional.</w:t>
+        <w:t xml:space="preserve">Purchase Price is required for Owner (Asset) provenance. Purchase Date and Purchase From are optional.</w:t>
       </w:r>
     </w:p>
     <w:tbl>
@@ -1184,6 +1184,30 @@
               <w:pStyle w:val="Compact"/>
             </w:pPr>
             <w:r>
+              <w:t xml:space="preserve">Yes</w:t>
+            </w:r>
+          </w:p>
+        </w:tc>
+      </w:tr>
+      <w:tr>
+        <w:tc>
+          <w:tcPr/>
+          <w:p>
+            <w:pPr>
+              <w:pStyle w:val="Compact"/>
+            </w:pPr>
+            <w:r>
+              <w:t xml:space="preserve">Purchase Date</w:t>
+            </w:r>
+          </w:p>
+        </w:tc>
+        <w:tc>
+          <w:tcPr/>
+          <w:p>
+            <w:pPr>
+              <w:pStyle w:val="Compact"/>
+            </w:pPr>
+            <w:r>
               <w:t xml:space="preserve">No</w:t>
             </w:r>
           </w:p>
@@ -1197,7 +1221,7 @@
               <w:pStyle w:val="Compact"/>
             </w:pPr>
             <w:r>
-              <w:t xml:space="preserve">Purchase Date</w:t>
+              <w:t xml:space="preserve">Purchase From</w:t>
             </w:r>
           </w:p>
         </w:tc>
@@ -1213,30 +1237,6 @@
           </w:p>
         </w:tc>
       </w:tr>
-      <w:tr>
-        <w:tc>
-          <w:tcPr/>
-          <w:p>
-            <w:pPr>
-              <w:pStyle w:val="Compact"/>
-            </w:pPr>
-            <w:r>
-              <w:t xml:space="preserve">Purchase From</w:t>
-            </w:r>
-          </w:p>
-        </w:tc>
-        <w:tc>
-          <w:tcPr/>
-          <w:p>
-            <w:pPr>
-              <w:pStyle w:val="Compact"/>
-            </w:pPr>
-            <w:r>
-              <w:t xml:space="preserve">No</w:t>
-            </w:r>
-          </w:p>
-        </w:tc>
-      </w:tr>
     </w:tbl>
     <w:p>
       <w:pPr>
@@ -1251,7 +1251,7 @@
         <w:pStyle w:val="BodyText"/>
       </w:pPr>
       <w:r>
-        <w:t xml:space="preserve">Many owners acquired the watch through secondary-market transactions and may not know the original details.</w:t>
+        <w:t xml:space="preserve">Purchase Price must be greater than 0 and is used as private owner cost basis. Optional purchase fields still validate when filled.</w:t>
       </w:r>
     </w:p>
     <w:p>
@@ -1757,7 +1757,7 @@
         <w:pStyle w:val="FirstParagraph"/>
       </w:pPr>
       <w:r>
-        <w:t xml:space="preserve">The minimum required fields for a valid Sale listing are:</w:t>
+        <w:t xml:space="preserve">The minimum required fields for a valid Sale listing are below. Asking Price is optional:</w:t>
       </w:r>
     </w:p>
     <w:p>
@@ -1817,7 +1817,7 @@
         </w:numPr>
       </w:pPr>
       <w:r>
-        <w:t xml:space="preserve">Price (THB)</w:t>
+        <w:t xml:space="preserve">Asking Price (optional; validate greater than 0 when filled)</w:t>
       </w:r>
     </w:p>
     <w:p>
@@ -1849,7 +1849,7 @@
         <w:pStyle w:val="FirstParagraph"/>
       </w:pPr>
       <w:r>
-        <w:t xml:space="preserve">This represents the recommended minimum dataset for the Tukdaeng Marketplace MVP.</w:t>
+        <w:t xml:space="preserve">Asking Price is optional for Sale. If filled, it must be greater than 0; if empty, buyer-facing surfaces must show Price on request. This represents the recommended minimum dataset for the Tukdaeng Marketplace MVP.</w:t>
       </w:r>
     </w:p>
     <w:p>

</xml_diff>